<commit_message>
Calculated nav mesh distances
</commit_message>
<xml_diff>
--- a/data/ethics/Introduction_Debrief.docx
+++ b/data/ethics/Introduction_Debrief.docx
@@ -35,19 +35,10 @@
         <w:t xml:space="preserve"> different</w:t>
       </w:r>
       <w:r>
-        <w:t xml:space="preserve"> visualizations for localising sound in </w:t>
-      </w:r>
-      <w:r>
-        <w:t>A</w:t>
-      </w:r>
-      <w:r>
-        <w:t xml:space="preserve">ugmented </w:t>
-      </w:r>
-      <w:r>
-        <w:t>R</w:t>
-      </w:r>
-      <w:r>
-        <w:t>eality</w:t>
+        <w:t xml:space="preserve"> visualizations for localising sound</w:t>
+      </w:r>
+      <w:r>
+        <w:t xml:space="preserve"> using Augmented Reality</w:t>
       </w:r>
       <w:r>
         <w:t>. We cannot tell how the</w:t>
@@ -85,6 +76,9 @@
         <w:t>6</w:t>
       </w:r>
       <w:r>
+        <w:t>0</w:t>
+      </w:r>
+      <w:r>
         <w:t xml:space="preserve"> visualizations to locate sound in a simulated virtual environment. I will be observing you while you perform the tasks and metric data such as time taken to complete task will be recorded. Please ask questions </w:t>
       </w:r>
       <w:r>
@@ -146,7 +140,13 @@
     </w:p>
     <w:p>
       <w:r>
-        <w:t>Please remember that it is the system, not you, that is being evaluated. You are welcome to withdraw from the experiment at any time. Do you agree to taking part in this evaluation?  Do you have any questions before we start?</w:t>
+        <w:t>Please remember that it is the system, not you, that is being evaluated. You are welcome to withdraw from the experiment at any time</w:t>
+      </w:r>
+      <w:r>
+        <w:t xml:space="preserve"> or take a break at any time</w:t>
+      </w:r>
+      <w:r>
+        <w:t>. Do you agree to taking part in this evaluation?  Do you have any questions before we start?</w:t>
       </w:r>
     </w:p>
     <w:p/>
@@ -184,10 +184,13 @@
         <w:t>e</w:t>
       </w:r>
       <w:r>
-        <w:t xml:space="preserve"> of my email address and </w:t>
-      </w:r>
-      <w:r>
-        <w:t xml:space="preserve">my </w:t>
+        <w:t xml:space="preserve"> of m</w:t>
+      </w:r>
+      <w:r>
+        <w:t>ine and my</w:t>
+      </w:r>
+      <w:r>
+        <w:t xml:space="preserve"> </w:t>
       </w:r>
       <w:r>
         <w:t>supervisor’s</w:t>
@@ -833,6 +836,7 @@
   <w:style w:type="character" w:default="1" w:styleId="DefaultParagraphFont">
     <w:name w:val="Default Paragraph Font"/>
     <w:uiPriority w:val="1"/>
+    <w:semiHidden/>
     <w:unhideWhenUsed/>
   </w:style>
   <w:style w:type="table" w:default="1" w:styleId="TableNormal">

</xml_diff>